<commit_message>
feat: PE SWE Cau 1
</commit_message>
<xml_diff>
--- a/Subject/SWE202c/Source Template/cau1_template_001.docx
+++ b/Subject/SWE202c/Source Template/cau1_template_001.docx
@@ -109,25 +109,34 @@
           <w:rStyle w:val="6"/>
           <w:rFonts w:hint="default"/>
         </w:rPr>
-        <w:t>2. Iterative delivery and stakeholder feedback:</w:t>
-      </w:r>
-    </w:p>
-    <w:p>
-      <w:pPr>
-        <w:bidi w:val="0"/>
-        <w:rPr>
-          <w:rFonts w:hint="default" w:ascii="Times New Roman" w:hAnsi="Times New Roman" w:cs="Times New Roman"/>
-          <w:sz w:val="24"/>
-          <w:szCs w:val="24"/>
-        </w:rPr>
-      </w:pPr>
-      <w:r>
-        <w:rPr>
-          <w:rFonts w:hint="default" w:ascii="Times New Roman" w:hAnsi="Times New Roman" w:cs="Times New Roman"/>
-          <w:sz w:val="24"/>
-          <w:szCs w:val="24"/>
-        </w:rPr>
-        <w:t>The system serves multiple distinct user groups, including &lt;Liệt kê 3-4 nhóm user trong đề - VD: Students, Lecturers, Academic Staff, System Admin&gt;. Agile allows the development team to deliver functional modules iteratively (e.g., in 2-4 week Sprints). This ensures regular feedback from all stakeholders, guaranteeing the final product meets actual operational needs before full deployment.</w:t>
+        <w:t>2. Iterative delivery and stakeholder f</w:t>
+      </w:r>
+      <w:bookmarkStart w:id="0" w:name="_GoBack"/>
+      <w:bookmarkEnd w:id="0"/>
+      <w:r>
+        <w:rPr>
+          <w:rStyle w:val="6"/>
+          <w:rFonts w:hint="default"/>
+        </w:rPr>
+        <w:t>eedback:</w:t>
+      </w:r>
+    </w:p>
+    <w:p>
+      <w:pPr>
+        <w:bidi w:val="0"/>
+        <w:rPr>
+          <w:rFonts w:hint="default" w:ascii="Times New Roman" w:hAnsi="Times New Roman" w:cs="Times New Roman"/>
+          <w:sz w:val="24"/>
+          <w:szCs w:val="24"/>
+        </w:rPr>
+      </w:pPr>
+      <w:r>
+        <w:rPr>
+          <w:rFonts w:hint="default" w:ascii="Times New Roman" w:hAnsi="Times New Roman" w:cs="Times New Roman"/>
+          <w:sz w:val="24"/>
+          <w:szCs w:val="24"/>
+        </w:rPr>
+        <w:t>The system serves multiple distinct user groups, including &lt;Liệt kê 3-4 nhóm user trong đề - VD: Students, Lecturers, Academic Staff, System Admin. Agile allows the development team to deliver functional modules iteratively (e.g., in 2-4 week Sprints). This ensures regular feedback from all stakeholders, guaranteeing the final product meets actual operational needs before full deployment.</w:t>
       </w:r>
     </w:p>
     <w:p>
@@ -576,10 +585,7 @@
         <w:t>: No early working software is available for &lt;Nhắc lại 1 nhóm user - VD: Lecturers&gt; to test, leading to a high risk of poor usability upon final release.</w:t>
       </w:r>
     </w:p>
-    <w:p>
-      <w:bookmarkStart w:id="0" w:name="_GoBack"/>
-      <w:bookmarkEnd w:id="0"/>
-    </w:p>
+    <w:p/>
     <w:sectPr>
       <w:pgSz w:w="11906" w:h="16838"/>
       <w:pgMar w:top="1440" w:right="1800" w:bottom="1440" w:left="1800" w:header="720" w:footer="720" w:gutter="0"/>

</xml_diff>